<commit_message>
Hướng dẫn Cho thuê giàn giáo: tiền thuê vào doanh thu theo từng đợt trả; QA G-06
Co-Authored-By: Claude Opus 5.5 <noreply@anthropic.com>
</commit_message>
<xml_diff>
--- a/doc/demo/huong-dan/06_CHO_THUE_GIAN_GIAO.docx
+++ b/doc/demo/huong-dan/06_CHO_THUE_GIAN_GIAO.docx
@@ -2949,7 +2949,59 @@
           <w:sz w:val="21"/>
           <w:szCs w:val="21"/>
         </w:rPr>
-        <w:t xml:space="preserve"> = số lượng trả × đơn giá/ngày × số ngày từ ngày bắt đầu thuê tới ngày trả của đợt. Hàng trả sớm không phải trả tiền cho quãng sau khi đã về kho.</w:t>
+        <w:t xml:space="preserve"> = số lượng trả × đơn giá/ngày × số ngày từ ngày bắt đầu thuê tới ngày trả của đợt. Hàng trả sớm không phải trả tiền cho quãng sau khi đã về kho. Tiền của đợt vào </w:t>
+      </w:r>
+      <w:r>
+        <w:rPr>
+          <w:rFonts w:ascii="Calibri" w:cs="Calibri" w:eastAsia="Calibri" w:hAnsi="Calibri"/>
+          <w:b/>
+          <w:bCs/>
+          <w:i w:val="false"/>
+          <w:iCs w:val="false"/>
+          <w:color w:val="1F2933"/>
+          <w:sz w:val="21"/>
+          <w:szCs w:val="21"/>
+        </w:rPr>
+        <w:t xml:space="preserve">doanh thu</w:t>
+      </w:r>
+      <w:r>
+        <w:rPr>
+          <w:rFonts w:ascii="Calibri" w:cs="Calibri" w:eastAsia="Calibri" w:hAnsi="Calibri"/>
+          <w:b w:val="false"/>
+          <w:bCs w:val="false"/>
+          <w:i w:val="false"/>
+          <w:iCs w:val="false"/>
+          <w:color w:val="1F2933"/>
+          <w:sz w:val="21"/>
+          <w:szCs w:val="21"/>
+        </w:rPr>
+        <w:t xml:space="preserve"> ở Tổng quan tài chính ngay theo </w:t>
+      </w:r>
+      <w:r>
+        <w:rPr>
+          <w:rFonts w:ascii="Calibri" w:cs="Calibri" w:eastAsia="Calibri" w:hAnsi="Calibri"/>
+          <w:b/>
+          <w:bCs/>
+          <w:i w:val="false"/>
+          <w:iCs w:val="false"/>
+          <w:color w:val="1F2933"/>
+          <w:sz w:val="21"/>
+          <w:szCs w:val="21"/>
+        </w:rPr>
+        <w:t xml:space="preserve">ngày trả của đợt</w:t>
+      </w:r>
+      <w:r>
+        <w:rPr>
+          <w:rFonts w:ascii="Calibri" w:cs="Calibri" w:eastAsia="Calibri" w:hAnsi="Calibri"/>
+          <w:b w:val="false"/>
+          <w:bCs w:val="false"/>
+          <w:i w:val="false"/>
+          <w:iCs w:val="false"/>
+          <w:color w:val="1F2933"/>
+          <w:sz w:val="21"/>
+          <w:szCs w:val="21"/>
+        </w:rPr>
+        <w:t xml:space="preserve"> — không đợi khách trả hết.</w:t>
       </w:r>
     </w:p>
     <w:p>
@@ -3548,42 +3600,6 @@
       <w:r>
         <w:rPr>
           <w:rFonts w:ascii="Calibri" w:cs="Calibri" w:eastAsia="Calibri" w:hAnsi="Calibri"/>
-          <w:b/>
-          <w:bCs/>
-          <w:i w:val="false"/>
-          <w:iCs w:val="false"/>
-          <w:color w:val="1F2933"/>
-          <w:sz w:val="21"/>
-          <w:szCs w:val="21"/>
-        </w:rPr>
-        <w:t xml:space="preserve">Tiền thuê vào báo cáo doanh thu khi hợp đồng thu hồi hết</w:t>
-      </w:r>
-      <w:r>
-        <w:rPr>
-          <w:rFonts w:ascii="Calibri" w:cs="Calibri" w:eastAsia="Calibri" w:hAnsi="Calibri"/>
-          <w:b w:val="false"/>
-          <w:bCs w:val="false"/>
-          <w:i w:val="false"/>
-          <w:iCs w:val="false"/>
-          <w:color w:val="1F2933"/>
-          <w:sz w:val="21"/>
-          <w:szCs w:val="21"/>
-        </w:rPr>
-        <w:t xml:space="preserve">, ghi vào ngày trả cuối. Đợt trả một phần đã chốt tiền trên hợp đồng nhưng chưa hiện trên biểu đồ doanh thu của Tổng quan tài chính.</w:t>
-      </w:r>
-    </w:p>
-    <w:p>
-      <w:pPr>
-        <w:pStyle w:val="ListParagraph"/>
-        <w:numPr>
-          <w:ilvl w:val="0"/>
-          <w:numId w:val="2"/>
-        </w:numPr>
-        <w:spacing w:after="70" w:line="276"/>
-      </w:pPr>
-      <w:r>
-        <w:rPr>
-          <w:rFonts w:ascii="Calibri" w:cs="Calibri" w:eastAsia="Calibri" w:hAnsi="Calibri"/>
           <w:b w:val="false"/>
           <w:bCs w:val="false"/>
           <w:i w:val="false"/>
@@ -3694,8 +3710,8 @@
         </w:tblBorders>
       </w:tblPr>
       <w:tblGrid>
-        <w:gridCol w:w="4036"/>
-        <w:gridCol w:w="5602"/>
+        <w:gridCol w:w="3844"/>
+        <w:gridCol w:w="5794"/>
       </w:tblGrid>
       <w:tr>
         <w:trPr>
@@ -3703,7 +3719,7 @@
         </w:trPr>
         <w:tc>
           <w:tcPr>
-            <w:tcW w:type="dxa" w:w="4036"/>
+            <w:tcW w:type="dxa" w:w="3844"/>
             <w:shd w:fill="EAF1EE" w:color="auto" w:val="clear"/>
             <w:tcMar>
               <w:top w:type="dxa" w:w="60"/>
@@ -3733,7 +3749,7 @@
         </w:tc>
         <w:tc>
           <w:tcPr>
-            <w:tcW w:type="dxa" w:w="5602"/>
+            <w:tcW w:type="dxa" w:w="5794"/>
             <w:shd w:fill="EAF1EE" w:color="auto" w:val="clear"/>
             <w:tcMar>
               <w:top w:type="dxa" w:w="60"/>
@@ -3768,7 +3784,7 @@
         </w:trPr>
         <w:tc>
           <w:tcPr>
-            <w:tcW w:type="dxa" w:w="4036"/>
+            <w:tcW w:type="dxa" w:w="3844"/>
             <w:tcMar>
               <w:top w:type="dxa" w:w="60"/>
               <w:left w:type="dxa" w:w="90"/>
@@ -3797,7 +3813,7 @@
         </w:tc>
         <w:tc>
           <w:tcPr>
-            <w:tcW w:type="dxa" w:w="5602"/>
+            <w:tcW w:type="dxa" w:w="5794"/>
             <w:tcMar>
               <w:top w:type="dxa" w:w="60"/>
               <w:left w:type="dxa" w:w="90"/>
@@ -3831,7 +3847,7 @@
         </w:trPr>
         <w:tc>
           <w:tcPr>
-            <w:tcW w:type="dxa" w:w="4036"/>
+            <w:tcW w:type="dxa" w:w="3844"/>
             <w:tcMar>
               <w:top w:type="dxa" w:w="60"/>
               <w:left w:type="dxa" w:w="90"/>
@@ -3860,7 +3876,7 @@
         </w:tc>
         <w:tc>
           <w:tcPr>
-            <w:tcW w:type="dxa" w:w="5602"/>
+            <w:tcW w:type="dxa" w:w="5794"/>
             <w:tcMar>
               <w:top w:type="dxa" w:w="60"/>
               <w:left w:type="dxa" w:w="90"/>
@@ -3920,7 +3936,7 @@
         </w:trPr>
         <w:tc>
           <w:tcPr>
-            <w:tcW w:type="dxa" w:w="4036"/>
+            <w:tcW w:type="dxa" w:w="3844"/>
             <w:tcMar>
               <w:top w:type="dxa" w:w="60"/>
               <w:left w:type="dxa" w:w="90"/>
@@ -3949,7 +3965,7 @@
         </w:tc>
         <w:tc>
           <w:tcPr>
-            <w:tcW w:type="dxa" w:w="5602"/>
+            <w:tcW w:type="dxa" w:w="5794"/>
             <w:tcMar>
               <w:top w:type="dxa" w:w="60"/>
               <w:left w:type="dxa" w:w="90"/>
@@ -3983,7 +3999,7 @@
         </w:trPr>
         <w:tc>
           <w:tcPr>
-            <w:tcW w:type="dxa" w:w="4036"/>
+            <w:tcW w:type="dxa" w:w="3844"/>
             <w:tcMar>
               <w:top w:type="dxa" w:w="60"/>
               <w:left w:type="dxa" w:w="90"/>
@@ -4012,7 +4028,7 @@
         </w:tc>
         <w:tc>
           <w:tcPr>
-            <w:tcW w:type="dxa" w:w="5602"/>
+            <w:tcW w:type="dxa" w:w="5794"/>
             <w:tcMar>
               <w:top w:type="dxa" w:w="60"/>
               <w:left w:type="dxa" w:w="90"/>
@@ -4072,7 +4088,7 @@
         </w:trPr>
         <w:tc>
           <w:tcPr>
-            <w:tcW w:type="dxa" w:w="4036"/>
+            <w:tcW w:type="dxa" w:w="3844"/>
             <w:tcMar>
               <w:top w:type="dxa" w:w="60"/>
               <w:left w:type="dxa" w:w="90"/>
@@ -4095,13 +4111,13 @@
                 <w:sz w:val="19"/>
                 <w:szCs w:val="19"/>
               </w:rPr>
-              <w:t xml:space="preserve">Vì sao tiền thuê của Đông Đô chưa lên biểu đồ doanh thu?</w:t>
+              <w:t xml:space="preserve">Tiền thuê của đợt trả một phần có vào báo cáo không?</w:t>
             </w:r>
           </w:p>
         </w:tc>
         <w:tc>
           <w:tcPr>
-            <w:tcW w:type="dxa" w:w="5602"/>
+            <w:tcW w:type="dxa" w:w="5794"/>
             <w:tcMar>
               <w:top w:type="dxa" w:w="60"/>
               <w:left w:type="dxa" w:w="90"/>
@@ -4124,7 +4140,7 @@
                 <w:sz w:val="19"/>
                 <w:szCs w:val="19"/>
               </w:rPr>
-              <w:t xml:space="preserve">Hợp đồng chưa thu hồi hết — xem mục 8.</w:t>
+              <w:t xml:space="preserve">Có — vào doanh thu ở Tổng quan tài chính theo ngày trả của đợt đó (Đông Đô: 7.149.600 đồng ngày 27/09/2026).</w:t>
             </w:r>
           </w:p>
         </w:tc>

</xml_diff>